<commit_message>
Reflect GUI in report and demo script; fix test count 36->40, regenerate PDF
Co-Authored-By: Claude Opus 4.8 <noreply@anthropic.com>
</commit_message>
<xml_diff>
--- a/2026 오픈소스 개발자대회 결과보고서_파비스.docx
+++ b/2026 오픈소스 개발자대회 결과보고서_파비스.docx
@@ -1303,7 +1303,7 @@
               <w:br/>
               <w:t>- 실행 환경: Windows / macOS / Linux 크로스플랫폼 명령행(CLI) 도구</w:t>
               <w:br/>
-              <w:t>- 테스트: pytest (단위 테스트 36건)</w:t>
+              <w:t>- 테스트: pytest (단위 테스트 40건)</w:t>
               <w:br/>
               <w:t>- 패키징: pyproject.toml 기반 콘솔 스크립트(vibeguard)</w:t>
               <w:br/>
@@ -1549,6 +1549,8 @@
               <w:t>- git pre-commit 훅 자동 설치(init-hooks)와 --fail-on 옵션으로 커밋·CI 단계 차단</w:t>
               <w:br/>
               <w:t>- 개발 과정: 규칙 엔진 → 슬롭스쿼팅 탐지 → CLI·리포터·훅 → 데모 취약 앱·단위 테스트 순으로 구현, 전 규칙 테스트 통과</w:t>
+              <w:br/>
+              <w:t>- 브라우저 GUI(vibeguard gui): 외부 의존성 없이 로컬 웹 UI로 보안 점수·취약점 카드·슬롭스쿼팅을 시각화</w:t>
             </w:r>
           </w:p>
           <w:p>
@@ -1593,7 +1595,9 @@
               <w:br/>
               <w:t>- 데모: examples/vibe_coded_app(의도적으로 취약하게 작성한 Flask·Express 예제 앱) 스캔 시 취약점 22건 탐지(치명 4·높음 11·중간 6·낮음 1), 슬롭스쿼팅 expres·reqeusts 포함, 보안 점수 0/100(F등급)</w:t>
               <w:br/>
-              <w:t>- 테스트: pytest 단위 테스트 36건 전부 통과</w:t>
+              <w:t>- 테스트: pytest 단위 테스트 40건 전부 통과</w:t>
+              <w:br/>
+              <w:t>- GUI 실행: vibeguard gui → 브라우저에서 경로 입력·스캔(보안 점수 링·취약점 카드·슬롭스쿼팅 확인)</w:t>
             </w:r>
           </w:p>
           <w:p>

</xml_diff>

<commit_message>
Report: reflect SARIF/CI/HTML/baseline/config and 42 rules, 69 tests; regenerate PDF
Co-Authored-By: Claude Opus 4.8 <noreply@anthropic.com>
</commit_message>
<xml_diff>
--- a/2026 오픈소스 개발자대회 결과보고서_파비스.docx
+++ b/2026 오픈소스 개발자대회 결과보고서_파비스.docx
@@ -1303,7 +1303,7 @@
               <w:br/>
               <w:t>- 실행 환경: Windows / macOS / Linux 크로스플랫폼 명령행(CLI) 도구</w:t>
               <w:br/>
-              <w:t>- 테스트: pytest (단위 테스트 40건)</w:t>
+              <w:t>- 테스트: pytest (단위 테스트 69건)</w:t>
               <w:br/>
               <w:t>- 패키징: pyproject.toml 기반 콘솔 스크립트(vibeguard)</w:t>
               <w:br/>
@@ -1551,6 +1551,10 @@
               <w:t>- 개발 과정: 규칙 엔진 → 슬롭스쿼팅 탐지 → CLI·리포터·훅 → 데모 취약 앱·단위 테스트 순으로 구현, 전 규칙 테스트 통과</w:t>
               <w:br/>
               <w:t>- 브라우저 GUI(vibeguard gui): 외부 의존성 없이 로컬 웹 UI로 보안 점수·취약점 카드·슬롭스쿼팅을 시각화</w:t>
+              <w:br/>
+              <w:t>- 다양한 출력과 연동: 터미널·JSON·Markdown·SARIF(GitHub 코드 스캐닝)·단독 HTML 리포트, GitHub Actions CI(SARIF 업로드), 베이스라인(기존 코드 수용)·설정 파일(.vibeguard.json) 지원</w:t>
+              <w:br/>
+              <w:t>- 총 42개 규칙(시크릿·위험실행·인젝션·웹·암호·경로·공급망)과 단위 테스트 69개 통과, 도구 자체 코드는 발견 0건</w:t>
             </w:r>
           </w:p>
           <w:p>
@@ -1595,7 +1599,7 @@
               <w:br/>
               <w:t>- 데모: examples/vibe_coded_app(의도적으로 취약하게 작성한 Flask·Express 예제 앱) 스캔 시 취약점 22건 탐지(치명 4·높음 11·중간 6·낮음 1), 슬롭스쿼팅 expres·reqeusts 포함, 보안 점수 0/100(F등급)</w:t>
               <w:br/>
-              <w:t>- 테스트: pytest 단위 테스트 40건 전부 통과</w:t>
+              <w:t>- 테스트: pytest 단위 테스트 69건 전부 통과</w:t>
               <w:br/>
               <w:t>- GUI 실행: vibeguard gui → 브라우저에서 경로 입력·스캔(보안 점수 링·취약점 카드·슬롭스쿼팅 확인)</w:t>
             </w:r>

</xml_diff>

<commit_message>
Report: sync to 48 rules / 79 tests / multi-language (Go, PHP); regenerate PDF
Co-Authored-By: Claude Opus 4.8 <noreply@anthropic.com>
</commit_message>
<xml_diff>
--- a/2026 오픈소스 개발자대회 결과보고서_파비스.docx
+++ b/2026 오픈소스 개발자대회 결과보고서_파비스.docx
@@ -1303,7 +1303,7 @@
               <w:br/>
               <w:t>- 실행 환경: Windows / macOS / Linux 크로스플랫폼 명령행(CLI) 도구</w:t>
               <w:br/>
-              <w:t>- 테스트: pytest (단위 테스트 69건)</w:t>
+              <w:t>- 테스트: pytest (단위 테스트 79건)</w:t>
               <w:br/>
               <w:t>- 패키징: pyproject.toml 기반 콘솔 스크립트(vibeguard)</w:t>
               <w:br/>
@@ -1554,7 +1554,7 @@
               <w:br/>
               <w:t>- 다양한 출력과 연동: 터미널·JSON·Markdown·SARIF(GitHub 코드 스캐닝)·단독 HTML 리포트, GitHub Actions CI(SARIF 업로드), 베이스라인(기존 코드 수용)·설정 파일(.vibeguard.json) 지원</w:t>
               <w:br/>
-              <w:t>- 총 42개 규칙(시크릿·위험실행·인젝션·웹·암호·경로·공급망)과 단위 테스트 69개 통과, 도구 자체 코드는 발견 0건</w:t>
+              <w:t>- 총 48개 규칙(시크릿·위험실행·인젝션·웹·암호·경로·공급망, 지원 언어 Python·JS·TS·Go·PHP)과 단위 테스트 79개 통과, 도구 자체 코드는 발견 0건</w:t>
             </w:r>
           </w:p>
           <w:p>
@@ -1599,7 +1599,7 @@
               <w:br/>
               <w:t>- 데모: examples/vibe_coded_app(의도적으로 취약하게 작성한 Flask·Express 예제 앱) 스캔 시 취약점 22건 탐지(치명 4·높음 11·중간 6·낮음 1), 슬롭스쿼팅 expres·reqeusts 포함, 보안 점수 0/100(F등급)</w:t>
               <w:br/>
-              <w:t>- 테스트: pytest 단위 테스트 69건 전부 통과</w:t>
+              <w:t>- 테스트: pytest 단위 테스트 79건 전부 통과</w:t>
               <w:br/>
               <w:t>- GUI 실행: vibeguard gui → 브라우저에서 경로 입력·스캔(보안 점수 링·취약점 카드·슬롭스쿼팅 확인)</w:t>
             </w:r>

</xml_diff>

<commit_message>
Report: sync to 54 rules / 85 tests / 6 languages (add Ruby, Java); regenerate PDF
Co-Authored-By: Claude Opus 4.8 <noreply@anthropic.com>
</commit_message>
<xml_diff>
--- a/2026 오픈소스 개발자대회 결과보고서_파비스.docx
+++ b/2026 오픈소스 개발자대회 결과보고서_파비스.docx
@@ -1303,7 +1303,7 @@
               <w:br/>
               <w:t>- 실행 환경: Windows / macOS / Linux 크로스플랫폼 명령행(CLI) 도구</w:t>
               <w:br/>
-              <w:t>- 테스트: pytest (단위 테스트 79건)</w:t>
+              <w:t>- 테스트: pytest (단위 테스트 85건)</w:t>
               <w:br/>
               <w:t>- 패키징: pyproject.toml 기반 콘솔 스크립트(vibeguard)</w:t>
               <w:br/>
@@ -1554,7 +1554,7 @@
               <w:br/>
               <w:t>- 다양한 출력과 연동: 터미널·JSON·Markdown·SARIF(GitHub 코드 스캐닝)·단독 HTML 리포트, GitHub Actions CI(SARIF 업로드), 베이스라인(기존 코드 수용)·설정 파일(.vibeguard.json) 지원</w:t>
               <w:br/>
-              <w:t>- 총 48개 규칙(시크릿·위험실행·인젝션·웹·암호·경로·공급망, 지원 언어 Python·JS·TS·Go·PHP)과 단위 테스트 79개 통과, 도구 자체 코드는 발견 0건</w:t>
+              <w:t>- 총 54개 규칙(시크릿·위험실행·인젝션·웹·암호·경로·공급망, 지원 언어 Python·JS·TS·Go·PHP·Ruby·Java)과 단위 테스트 85개 통과, 도구 자체 코드는 발견 0건</w:t>
             </w:r>
           </w:p>
           <w:p>
@@ -1599,7 +1599,7 @@
               <w:br/>
               <w:t>- 데모: examples/vibe_coded_app(의도적으로 취약하게 작성한 Flask·Express 예제 앱) 스캔 시 취약점 22건 탐지(치명 4·높음 11·중간 6·낮음 1), 슬롭스쿼팅 expres·reqeusts 포함, 보안 점수 0/100(F등급)</w:t>
               <w:br/>
-              <w:t>- 테스트: pytest 단위 테스트 79건 전부 통과</w:t>
+              <w:t>- 테스트: pytest 단위 테스트 85건 전부 통과</w:t>
               <w:br/>
               <w:t>- GUI 실행: vibeguard gui → 브라우저에서 경로 입력·스캔(보안 점수 링·취약점 카드·슬롭스쿼팅 확인)</w:t>
             </w:r>

</xml_diff>

<commit_message>
Report: sync to 91 tests and add AST precision differentiator; regenerate PDF
Co-Authored-By: Claude Opus 4.8 <noreply@anthropic.com>
</commit_message>
<xml_diff>
--- a/2026 오픈소스 개발자대회 결과보고서_파비스.docx
+++ b/2026 오픈소스 개발자대회 결과보고서_파비스.docx
@@ -1303,7 +1303,7 @@
               <w:br/>
               <w:t>- 실행 환경: Windows / macOS / Linux 크로스플랫폼 명령행(CLI) 도구</w:t>
               <w:br/>
-              <w:t>- 테스트: pytest (단위 테스트 85건)</w:t>
+              <w:t>- 테스트: pytest (단위 테스트 91건)</w:t>
               <w:br/>
               <w:t>- 패키징: pyproject.toml 기반 콘솔 스크립트(vibeguard)</w:t>
               <w:br/>
@@ -1554,7 +1554,7 @@
               <w:br/>
               <w:t>- 다양한 출력과 연동: 터미널·JSON·Markdown·SARIF(GitHub 코드 스캐닝)·단독 HTML 리포트, GitHub Actions CI(SARIF 업로드), 베이스라인(기존 코드 수용)·설정 파일(.vibeguard.json) 지원</w:t>
               <w:br/>
-              <w:t>- 총 54개 규칙(시크릿·위험실행·인젝션·웹·암호·경로·공급망, 지원 언어 Python·JS·TS·Go·PHP·Ruby·Java)과 단위 테스트 85개 통과, 도구 자체 코드는 발견 0건</w:t>
+              <w:t>- 총 54개 규칙(시크릿·위험실행·인젝션·웹·암호·경로·공급망, 지원 언어 Python·JS·TS·Go·PHP·Ruby·Java)과 단위 테스트 91개 통과, 도구 자체 코드는 발견 0건</w:t>
             </w:r>
           </w:p>
           <w:p>
@@ -1599,7 +1599,7 @@
               <w:br/>
               <w:t>- 데모: examples/vibe_coded_app(의도적으로 취약하게 작성한 Flask·Express 예제 앱) 스캔 시 취약점 22건 탐지(치명 4·높음 11·중간 6·낮음 1), 슬롭스쿼팅 expres·reqeusts 포함, 보안 점수 0/100(F등급)</w:t>
               <w:br/>
-              <w:t>- 테스트: pytest 단위 테스트 85건 전부 통과</w:t>
+              <w:t>- 테스트: pytest 단위 테스트 91건 전부 통과</w:t>
               <w:br/>
               <w:t>- GUI 실행: vibeguard gui → 브라우저에서 경로 입력·스캔(보안 점수 링·취약점 카드·슬롭스쿼팅 확인)</w:t>
             </w:r>
@@ -1831,7 +1831,7 @@
               <w:rPr>
                 <w:color w:val="000000"/>
               </w:rPr>
-              <w:t>기존 정적 분석·시크릿 스캐너와 달리 '바이브코딩' 시나리오에 특화되어 있다. 특히 거대언어모델의 환각 패키지(슬롭스쿼팅)를 편집거리와 레지스트리 조회로 탐지하는 기능은 일반 린터에서 보기 드문 독창적 강점이다. 또한 런타임 외부 의존성이 전혀 없어 보안 도구 자체의 공급망 위험이 0이며, 한국어 친화 리포트와 git 훅 원클릭 연동으로 초심자도 즉시 사용할 수 있다.</w:t>
+              <w:t>기존 정적 분석·시크릿 스캐너와 달리 '바이브코딩' 시나리오에 특화되어 있다. 특히 거대언어모델의 환각 패키지(슬롭스쿼팅)를 편집거리와 레지스트리 조회로 탐지하는 기능은 일반 린터에서 보기 드문 독창적 강점이다. 또한 런타임 외부 의존성이 전혀 없어 보안 도구 자체의 공급망 위험이 0이며, 한국어 친화 리포트와 git 훅 원클릭 연동으로 초심자도 즉시 사용할 수 있다. 또한 Python AST 분석으로 문자열·문서 안의 가짜 양성을 걸러 정밀도를 높였다.</w:t>
             </w:r>
           </w:p>
           <w:p>

</xml_diff>

<commit_message>
Report: insert GUI result screenshot into 구동 및 시연 section; add screenshot generator
Co-Authored-By: Claude Opus 4.8 <noreply@anthropic.com>
</commit_message>
<xml_diff>
--- a/2026 오픈소스 개발자대회 결과보고서_파비스.docx
+++ b/2026 오픈소스 개발자대회 결과보고서_파비스.docx
@@ -1602,6 +1602,65 @@
               <w:t>- 테스트: pytest 단위 테스트 91건 전부 통과</w:t>
               <w:br/>
               <w:t>- GUI 실행: vibeguard gui → 브라우저에서 경로 입력·스캔(보안 점수 링·취약점 카드·슬롭스쿼팅 확인)</w:t>
+            </w:r>
+          </w:p>
+          <w:p>
+            <w:pPr>
+              <w:spacing w:before="80" w:after="40"/>
+              <w:jc w:val="center"/>
+            </w:pPr>
+            <w:r>
+              <w:drawing>
+                <wp:inline distT="0" distB="0" distL="0" distR="0">
+                  <wp:extent cx="3931920" cy="2503589"/>
+                  <wp:effectExtent l="0" t="0" r="0" b="0"/>
+                  <wp:docPr id="901" name="VibeGuard GUI"/>
+                  <wp:cNvGraphicFramePr>
+                    <a:graphicFrameLocks xmlns:a="http://schemas.openxmlformats.org/drawingml/2006/main" noChangeAspect="1"/>
+                  </wp:cNvGraphicFramePr>
+                  <a:graphic xmlns:a="http://schemas.openxmlformats.org/drawingml/2006/main">
+                    <a:graphicData uri="http://schemas.openxmlformats.org/drawingml/2006/picture">
+                      <pic:pic xmlns:pic="http://schemas.openxmlformats.org/drawingml/2006/picture">
+                        <pic:nvPicPr>
+                          <pic:cNvPr id="901" name="VibeGuard GUI"/>
+                          <pic:cNvPicPr/>
+                        </pic:nvPicPr>
+                        <pic:blipFill>
+                          <a:blip r:embed="rId9"/>
+                          <a:stretch>
+                            <a:fillRect/>
+                          </a:stretch>
+                        </pic:blipFill>
+                        <pic:spPr>
+                          <a:xfrm>
+                            <a:off x="0" y="0"/>
+                            <a:ext cx="3931920" cy="2503589"/>
+                          </a:xfrm>
+                          <a:prstGeom prst="rect">
+                            <a:avLst/>
+                          </a:prstGeom>
+                        </pic:spPr>
+                      </pic:pic>
+                    </a:graphicData>
+                  </a:graphic>
+                </wp:inline>
+              </w:drawing>
+            </w:r>
+          </w:p>
+          <w:p>
+            <w:pPr>
+              <w:jc w:val="center"/>
+              <w:rPr>
+                <w:color w:val="595959"/>
+                <w:sz w:val="16"/>
+              </w:rPr>
+            </w:pPr>
+            <w:r>
+              <w:rPr>
+                <w:color w:val="595959"/>
+                <w:sz w:val="16"/>
+              </w:rPr>
+              <w:t>[그림] VibeGuard 브라우저 GUI 스캔 결과 화면</w:t>
             </w:r>
           </w:p>
           <w:p>

</xml_diff>

<commit_message>
Report: reflect non-developer focus (standalone exe drag-drop, v0.1.0 release) and general-public framing in intro/background/effects
Co-Authored-By: Claude Opus 4.8 <noreply@anthropic.com>
</commit_message>
<xml_diff>
--- a/2026 오픈소스 개발자대회 결과보고서_파비스.docx
+++ b/2026 오픈소스 개발자대회 결과보고서_파비스.docx
@@ -1078,7 +1078,7 @@
               <w:rPr>
                 <w:color w:val="000000"/>
               </w:rPr>
-              <w:t>AI 코딩 어시스턴트가 생성한 코드(바이브코딩)에 숨은 보안 취약점과 환각 패키지(슬롭스쿼팅)를 자동 탐지하고, 위험 등급과 한국어 해결책을 제시하는 오픈소스 보안 스캐너 겸 git 커밋 가드레일.</w:t>
+              <w:t>코딩을 몰라도 실행파일을 받아 검사할 폴더만 끌어다 놓으면 된다. AI 코딩 도구가 만든 코드의 보안 취약점과 AI가 지어낸 가짜 패키지(슬롭스쿼팅)를 자동으로 찾아, 심각한 순서대로 어디가 왜 위험하고 어떻게 고치는지 보여 주는 오픈소스 보안 스캐너다.</w:t>
             </w:r>
           </w:p>
           <w:p>
@@ -1220,7 +1220,7 @@
               <w:rPr>
                 <w:color w:val="000000"/>
               </w:rPr>
-              <w:t>AI 코딩 어시스턴트의 확산으로 비전문가도 코드를 대량 생성하지만, 생성된 코드에는 하드코딩된 비밀키, eval 등 위험 함수, 취약한 암호(MD5 등), SQL·명령 인젝션 같은 보안 결함이 그대로 포함되는 경우가 많다. 특히 거대언어모델이 존재하지 않는 패키지명을 환각으로 추천하고 공격자가 그 이름을 악성 패키지로 선점하는 슬롭스쿼팅(slopsquatting) 공급망 위협이 새롭게 대두되고 있다. 본 프로젝트의 목적은 바이브코딩 사용자가 커밋·배포 전에 코드의 보안 취약점과 환각 패키지를 자동으로 점검받고, 위험과 해결책을 한국어로 안내받을 수 있는 무료 오픈소스 가드레일을 제공하는 것이다.</w:t>
+              <w:t>이제 비전문가도 AI에게 코드를 맡겨 앱·서비스를 만드는 '바이브코딩'이 보편화됐지만, 생성된 코드에는 하드코딩된 비밀키, eval 등 위험 함수, 취약한 암호, SQL·명령 인젝션 같은 보안 결함이 그대로 포함되는 경우가 많다. 특히 거대언어모델이 존재하지 않는 패키지명을 환각으로 추천하고 공격자가 그 이름을 악성 패키지로 선점하는 슬롭스쿼팅(slopsquatting) 공급망 위협도 새롭게 대두되고 있다. 그러나 보안은 비전문가에게 너무 어렵다. 개발 목적은 코딩을 몰라도 커밋·배포 전에 코드의 취약점과 환각 패키지를 자동으로 점검받고 무엇이 왜 위험하며 어떻게 고치는지 쉬운 말로 안내받아, 평범한 사람들의 창의적인 아이디어가 안전하게 세상에 나와 상용화되도록 돕는 것이다.</w:t>
             </w:r>
           </w:p>
         </w:tc>
@@ -1602,6 +1602,8 @@
               <w:t>- 테스트: pytest 단위 테스트 91건 전부 통과</w:t>
               <w:br/>
               <w:t>- GUI 실행: vibeguard gui → 브라우저에서 경로 입력·스캔(보안 점수 링·취약점 카드·슬롭스쿼팅 확인)</w:t>
+              <w:br/>
+              <w:t>- 비개발자 실행: GitHub Releases에서 단일 실행파일(Windows·macOS·Linux)을 받아 검사할 폴더를 끌어다 놓으면 브라우저에 리포트가 뜸(Python·터미널 불필요). 더블클릭 런처(VibeGuard-GUI.bat/.command)도 제공</w:t>
             </w:r>
           </w:p>
           <w:p>
@@ -1799,6 +1801,8 @@
               <w:t>- 시큐어코딩 교육 교보재, 사내 코드리뷰 보조 등으로 활용 가능</w:t>
               <w:br/>
               <w:t>- 생성형 AI 코딩 시장 성장에 따라 'AI 생성 코드 보안 점검' 수요 확대 기대</w:t>
+              <w:br/>
+              <w:t>- 코딩을 모르는 사람도 보안 걱정 없이 아이디어를 서비스로 만들 수 있어, 보안이 막연해 멈췄던 1인 개발자·학생·스타트업의 창의적 아이디어가 더 안전하게 상용화될 수 있음</w:t>
             </w:r>
           </w:p>
         </w:tc>

</xml_diff>